<commit_message>
KUT internal playbook: correct the originator advice, and gate the .docx
The hand-maintained internal playbook still advised the four-character PLNS
and widening the rule, and its overlay steps omitted project_config.json.
Eight paragraphs edited in place. check_hand_edited_sources now reads the
.docx paragraph by paragraph (red on the previous file). MOB-7 partial.

Co-Authored-By: Claude Opus 5.5 <noreply@anthropic.com>
</commit_message>
<xml_diff>
--- a/KUT_DOCS_WORKING/issued/KUT_BIM_MANAGER_PLAYBOOK_INTERNAL_STINGTOOLS.docx
+++ b/KUT_DOCS_WORKING/issued/KUT_BIM_MANAGER_PLAYBOOK_INTERNAL_STINGTOOLS.docx
@@ -581,7 +581,7 @@
               <w:t xml:space="preserve"> </w:t>
             </w:r>
             <w:r>
-              <w:t xml:space="preserve">(owner_standards / lod_matrix / tag_schemes / fohlio_map)</w:t>
+              <w:t xml:space="preserve">(the whole folder: owner_standards / lod_matrix / tag_schemes / fohlio_map / project_config / sting_classification)</w:t>
             </w:r>
           </w:p>
         </w:tc>
@@ -2059,7 +2059,7 @@
         <w:t xml:space="preserve">fohlio_map.json</w:t>
       </w:r>
       <w:r>
-        <w:t xml:space="preserve">) into the project so the eight-segment tag scheme, the LOD matrix, the naming and the Fohlio mapping are enforced as data, not by hand. When the Owner’s US standards arrive in week 1, you adopt them by</w:t>
+        <w:t xml:space="preserve">, project_config.json, sting_classification.json — the whole folder, not a subset) into the project so the eight-segment tag scheme, the LOD matrix, the naming and the Fohlio mapping are enforced as data, not by hand. When the Owner’s US standards arrive in week 1, you adopt them by</w:t>
       </w:r>
       <w:r>
         <w:t xml:space="preserve"> </w:t>
@@ -5912,7 +5912,7 @@
           <w:b/>
           <w:i w:val="0"/>
         </w:rPr>
-        <w:t>5. A numbering conflict you must resolve in Week 1.</w:t>
+        <w:t xml:space="preserve">5. Originator codes — resolved: three characters, from the register.</w:t>
       </w:r>
     </w:p>
     <w:p>
@@ -5921,7 +5921,7 @@
           <w:b w:val="0"/>
           <w:i w:val="0"/>
         </w:rPr>
-        <w:t>The sheet-number rule enforces exactly three characters for the originator code. Planscape's default code is the four-character PLNS, and the clean playbook uses PLNS in its worked example. So KUT-PLNS-01-GF-M3-A-0001 fails the check today, and KUT-PLN-... passes. Either issue three-character codes to every organisation, or widen the rule to three-to-six characters, which is closer to normal ISO 19650 practice. Settle it before anyone numbers anything - renumbering after Deliverable A is expensive and visible to the client.</w:t>
+        <w:t xml:space="preserve">Originator codes are exactly three characters, allocated by the originator register that the Lead Appointed Party issues. The Information Manager operates under Symbion, so the expected code is SMB — confirm it when the register is issued. Do not widen the rule: a register of three-character firm codes needs no change. The four-character PLNS used in earlier drafts is withdrawn and fails the check; any container numbered with it is renamed before issue (KUT_NAMING_MIGRATION_MAP.md). Number nothing until the register is issued — renumbering after Deliverable A is expensive and visible to the client.</w:t>
       </w:r>
     </w:p>
     <w:p>
@@ -6073,7 +6073,7 @@
               <w:rPr>
                 <w:sz w:val="18"/>
               </w:rPr>
-              <w:t>Settle the two blocking decisions: originator-code length (Part I item 5) and the volume/workset convention - per-volume worksets, or one model per volume. Write both into the BEP draft.</w:t>
+              <w:t xml:space="preserve">Settle the two blocking decisions: the originator register (Part I item 5) and the volume/workset convention - per-volume worksets, or one model per volume. Write both into the BEP draft.</w:t>
             </w:r>
           </w:p>
         </w:tc>
@@ -8036,33 +8036,33 @@
               <w:rPr>
                 <w:sz w:val="18"/>
               </w:rPr>
-              <w:t>Originator-code conflict unresolved</w:t>
-            </w:r>
-          </w:p>
-        </w:tc>
-        <w:tc>
-          <w:tcPr>
-            <w:tcW w:type="dxa" w:w="3120"/>
-          </w:tcPr>
-          <w:p>
-            <w:r>
-              <w:rPr>
-                <w:sz w:val="18"/>
-              </w:rPr>
-              <w:t>Every sheet number on the project is wrong, visibly, to the client</w:t>
-            </w:r>
-          </w:p>
-        </w:tc>
-        <w:tc>
-          <w:tcPr>
-            <w:tcW w:type="dxa" w:w="3120"/>
-          </w:tcPr>
-          <w:p>
-            <w:r>
-              <w:rPr>
-                <w:sz w:val="18"/>
-              </w:rPr>
-              <w:t>Settle it in Week 1, in writing, against the Owner register.</w:t>
+              <w:t xml:space="preserve">Originator register not yet issued</w:t>
+            </w:r>
+          </w:p>
+        </w:tc>
+        <w:tc>
+          <w:tcPr>
+            <w:tcW w:type="dxa" w:w="3120"/>
+          </w:tcPr>
+          <w:p>
+            <w:r>
+              <w:rPr>
+                <w:sz w:val="18"/>
+              </w:rPr>
+              <w:t xml:space="preserve">Containers numbered against a guessed code all need renaming, visibly to the client</w:t>
+            </w:r>
+          </w:p>
+        </w:tc>
+        <w:tc>
+          <w:tcPr>
+            <w:tcW w:type="dxa" w:w="3120"/>
+          </w:tcPr>
+          <w:p>
+            <w:r>
+              <w:rPr>
+                <w:sz w:val="18"/>
+              </w:rPr>
+              <w:t xml:space="preserve">Chase the register in Week 1, in writing; number nothing until it is issued.</w:t>
             </w:r>
           </w:p>
         </w:tc>

</xml_diff>